<commit_message>
Rebuild letterhead .docx header for robust cross-machine layout
The address block was aligned with runs of literal spaces, which broke on
any machine without the letterhead's fonts. Rebuild it as centered
paragraphs with a fixed indent clear of the logo, keeping the original
first-page design (logo, green underlined title, Cambria/Garamond fonts).
Also blank the page-2+ header, which carried leftover content from an
unrelated company, and refresh the preview PDF. The original .doc stays
byte-for-byte unchanged.

Co-Authored-By: Claude Fable 5 <noreply@anthropic.com>
Claude-Session: https://claude.ai/code/session_01TSaFJjMEcFc18hcGmusxrV
</commit_message>
<xml_diff>
--- a/templates/letterhead/JCPPL_letterhead.docx
+++ b/templates/letterhead/JCPPL_letterhead.docx
@@ -32,435 +32,13 @@
   <w:p>
     <w:pPr>
       <w:pStyle w:val="Header"/>
-      <w:tabs>
-        <w:tab w:val="clear" w:pos="720"/>
-        <w:tab w:val="center" w:pos="-2520" w:leader="none"/>
-        <w:tab w:val="right" w:pos="9900" w:leader="none"/>
-      </w:tabs>
-      <w:jc w:val="both"/>
       <w:rPr>
-        <w:sz w:val="16"/>
+        <w:sz w:val="2"/>
       </w:rPr>
     </w:pPr>
     <w:r>
       <w:rPr>
-        <w:sz w:val="16"/>
-      </w:rPr>
-    </w:r>
-  </w:p>
-  <w:tbl>
-    <w:tblPr>
-      <w:tblW w:w="31788" w:type="dxa"/>
-      <w:jc w:val="start"/>
-      <w:tblInd w:w="0" w:type="dxa"/>
-      <w:tblLayout w:type="fixed"/>
-      <w:tblCellMar>
-        <w:top w:w="0" w:type="dxa"/>
-        <w:start w:w="108" w:type="dxa"/>
-        <w:bottom w:w="0" w:type="dxa"/>
-        <w:end w:w="108" w:type="dxa"/>
-      </w:tblCellMar>
-    </w:tblPr>
-    <w:tblGrid>
-      <w:gridCol w:w="29398"/>
-      <w:gridCol w:w="2390"/>
-    </w:tblGrid>
-    <w:tr>
-      <w:trPr>
-        <w:trHeight w:val="1701" w:hRule="atLeast"/>
-      </w:trPr>
-      <w:tc>
-        <w:tcPr>
-          <w:tcW w:w="29398" w:type="dxa"/>
-          <w:tcBorders/>
-        </w:tcPr>
-        <w:p>
-          <w:pPr>
-            <w:pStyle w:val="Header"/>
-            <w:tabs>
-              <w:tab w:val="clear" w:pos="720"/>
-              <w:tab w:val="center" w:pos="-2520" w:leader="none"/>
-              <w:tab w:val="right" w:pos="9900" w:leader="none"/>
-            </w:tabs>
-            <w:jc w:val="both"/>
-            <w:rPr>
-              <w:sz w:val="16"/>
-              <w:lang w:val="en-US" w:eastAsia="en-US"/>
-            </w:rPr>
-          </w:pPr>
-          <w:r>
-            <w:rPr>
-              <w:lang w:val="en-US" w:eastAsia="en-US"/>
-            </w:rPr>
-            <mc:AlternateContent>
-              <mc:Choice Requires="wpg">
-                <w:drawing>
-                  <wp:inline distT="0" distB="0" distL="0" distR="0">
-                    <wp:extent cx="1935480" cy="1543050"/>
-                    <wp:effectExtent l="0" t="0" r="0" b="0"/>
-                    <wp:docPr id="1" name="Group 3"/>
-                    <a:graphic xmlns:a="http://schemas.openxmlformats.org/drawingml/2006/main">
-                      <a:graphicData uri="http://schemas.microsoft.com/office/word/2010/wordprocessingGroup">
-                        <wpg:wgp>
-                          <wpg:cNvGrpSpPr/>
-                          <wpg:grpSpPr>
-                            <a:xfrm>
-                              <a:off x="0" y="0"/>
-                              <a:ext cx="1935360" cy="1542960"/>
-                              <a:chOff x="0" y="0"/>
-                              <a:chExt cx="1935360" cy="1542960"/>
-                            </a:xfrm>
-                          </wpg:grpSpPr>
-                          <wps:wsp>
-                            <wps:cNvSpPr txBox="1"/>
-                            <wps:spPr>
-                              <a:xfrm>
-                                <a:off x="153720" y="1339920"/>
-                                <a:ext cx="1781640" cy="203040"/>
-                              </a:xfrm>
-                              <a:prstGeom prst="rect">
-                                <a:avLst/>
-                              </a:prstGeom>
-                              <a:noFill/>
-                              <a:ln w="0">
-                                <a:noFill/>
-                              </a:ln>
-                            </wps:spPr>
-                            <wps:txbx>
-                              <w:txbxContent>
-                                <w:p>
-                                  <w:pPr>
-                                    <w:overflowPunct w:val="false"/>
-                                    <w:bidi w:val="0"/>
-                                    <w:spacing w:before="0" w:after="0"/>
-                                    <w:jc w:val="center"/>
-                                    <w:rPr/>
-                                  </w:pPr>
-                                  <w:r>
-                                    <w:rPr>
-                                      <w:kern w:val="2"/>
-                                      <w:sz w:val="22"/>
-                                      <w:b/>
-                                      <w:szCs w:val="22"/>
-                                      <w:bCs/>
-                                      <w:rFonts w:ascii="Impact" w:hAnsi="Impact" w:eastAsia="+mn-ea" w:cs="+mn-cs"/>
-                                      <w:color w:val="auto"/>
-                                      <w:lang w:val="en-US" w:bidi="en-US"/>
-                                    </w:rPr>
-                                    <w:t xml:space="preserve">Jagannath Crushers </w:t>
-                                  </w:r>
-                                </w:p>
-                              </w:txbxContent>
-                            </wps:txbx>
-                            <wps:bodyPr wrap="square" anchor="t">
-                              <a:noAutofit/>
-                            </wps:bodyPr>
-                          </wps:wsp>
-                        </wpg:wgp>
-                      </a:graphicData>
-                    </a:graphic>
-                  </wp:inline>
-                </w:drawing>
-              </mc:Choice>
-              <mc:Fallback>
-                <w:pict>
-                  <v:group id="shape_0" alt="Group 3" style="position:absolute;margin-left:0pt;margin-top:0pt;width:152.4pt;height:121.5pt" coordorigin="0,0" coordsize="3048,2430">
-                    <v:shapetype id="_x0000_t75" coordsize="21600,21600" o:spt="75" o:preferrelative="t" path="m@4@5l@4@11@9@11@9@5xe" filled="f" stroked="f">
-                      <v:stroke joinstyle="miter"/>
-                      <v:formulas>
-                        <v:f eqn="if lineDrawn pixelLineWidth 0"/>
-                        <v:f eqn="sum @0 1 0"/>
-                        <v:f eqn="sum 0 0 @1"/>
-                        <v:f eqn="prod @2 1 2"/>
-                        <v:f eqn="prod @3 21600 pixelWidth"/>
-                        <v:f eqn="prod @3 21600 pixelHeight"/>
-                        <v:f eqn="sum @0 0 1"/>
-                        <v:f eqn="prod @6 1 2"/>
-                        <v:f eqn="prod @7 21600 pixelWidth"/>
-                        <v:f eqn="sum @8 21600 0"/>
-                        <v:f eqn="prod @7 21600 pixelHeight"/>
-                        <v:f eqn="sum @10 21600 0"/>
-                      </v:formulas>
-                      <v:path o:extrusionok="f" gradientshapeok="t" o:connecttype="rect"/>
-                      <o:lock v:ext="edit" aspectratio="t"/>
-                    </v:shapetype>
-                    <v:shape id="shape_0" ID="Picture 3" stroked="f" o:allowincell="t" style="position:absolute;left:0;top:0;width:53;height:34;mso-wrap-style:none;v-text-anchor:middle;mso-position-horizontal:center" type="_x0000_t75">
-                      <v:fill o:detectmouseclick="t" on="false"/>
-                      <v:stroke color="#3465a4" joinstyle="round" endcap="flat"/>
-                      <w10:wrap type="square"/>
-                    </v:shape>
-                    <v:shapetype id="_x0000_t202" coordsize="21600,21600" o:spt="202" path="m,l,21600l21600,21600l21600,xe">
-                      <v:stroke joinstyle="miter"/>
-                      <v:path gradientshapeok="t" o:connecttype="rect"/>
-                    </v:shapetype>
-                    <v:shape id="shape_0" stroked="f" o:allowincell="t" style="position:absolute;left:242;top:2110;width:2805;height:319;mso-wrap-style:none;v-text-anchor:top;mso-position-horizontal:center" type="_x0000_t202">
-                      <v:textbox>
-                        <w:txbxContent>
-                          <w:p>
-                            <w:pPr>
-                              <w:overflowPunct w:val="false"/>
-                              <w:bidi w:val="0"/>
-                              <w:spacing w:before="0" w:after="0"/>
-                              <w:jc w:val="center"/>
-                              <w:rPr/>
-                            </w:pPr>
-                            <w:r>
-                              <w:rPr>
-                                <w:kern w:val="2"/>
-                                <w:sz w:val="22"/>
-                                <w:b/>
-                                <w:szCs w:val="22"/>
-                                <w:bCs/>
-                                <w:rFonts w:ascii="Impact" w:hAnsi="Impact" w:eastAsia="+mn-ea" w:cs="+mn-cs"/>
-                                <w:color w:val="auto"/>
-                                <w:lang w:val="en-US" w:bidi="en-US"/>
-                              </w:rPr>
-                              <w:t xml:space="preserve">Jagannath Crushers </w:t>
-                            </w:r>
-                          </w:p>
-                        </w:txbxContent>
-                      </v:textbox>
-                      <v:fill o:detectmouseclick="t" on="false"/>
-                      <v:stroke color="#3465a4" joinstyle="round" endcap="flat"/>
-                      <w10:wrap type="square"/>
-                    </v:shape>
-                  </v:group>
-                </w:pict>
-              </mc:Fallback>
-            </mc:AlternateContent>
-          </w:r>
-        </w:p>
-      </w:tc>
-      <w:tc>
-        <w:tcPr>
-          <w:tcW w:w="2390" w:type="dxa"/>
-          <w:tcBorders/>
-        </w:tcPr>
-        <w:p>
-          <w:pPr>
-            <w:pStyle w:val="Heading1"/>
-            <w:spacing w:before="600" w:after="80"/>
-            <w:jc w:val="center"/>
-            <w:rPr>
-              <w:sz w:val="44"/>
-              <w:szCs w:val="44"/>
-              <w:lang w:val="en-US" w:eastAsia="en-US" w:bidi="en-US"/>
-            </w:rPr>
-          </w:pPr>
-          <w:r>
-            <w:rPr>
-              <w:sz w:val="44"/>
-              <w:szCs w:val="44"/>
-              <w:lang w:val="en-US" w:eastAsia="en-US" w:bidi="en-US"/>
-            </w:rPr>
-            <w:t>Jagannath Crushers</w:t>
-          </w:r>
-        </w:p>
-        <w:p>
-          <w:pPr>
-            <w:pStyle w:val="Header"/>
-            <w:tabs>
-              <w:tab w:val="clear" w:pos="720"/>
-              <w:tab w:val="center" w:pos="-2520" w:leader="none"/>
-              <w:tab w:val="right" w:pos="9900" w:leader="none"/>
-            </w:tabs>
-            <w:rPr>
-              <w:rFonts w:ascii="Arial" w:hAnsi="Arial" w:cs="Arial"/>
-              <w:sz w:val="18"/>
-              <w:szCs w:val="18"/>
-              <w:lang w:val="en-US" w:eastAsia="en-US"/>
-            </w:rPr>
-          </w:pPr>
-          <w:r>
-            <w:rPr>
-              <w:rFonts w:eastAsia="Arial" w:cs="Arial" w:ascii="Arial" w:hAnsi="Arial"/>
-              <w:sz w:val="18"/>
-              <w:szCs w:val="18"/>
-              <w:lang w:val="en-US" w:eastAsia="en-US"/>
-            </w:rPr>
-            <w:t xml:space="preserve">   </w:t>
-          </w:r>
-          <w:r>
-            <w:rPr>
-              <w:rFonts w:cs="Arial" w:ascii="Arial" w:hAnsi="Arial"/>
-              <w:sz w:val="18"/>
-              <w:szCs w:val="18"/>
-              <w:lang w:val="en-US" w:eastAsia="en-US"/>
-            </w:rPr>
-            <w:t>Plot 398,Lewis Road, Old Town,</w:t>
-          </w:r>
-        </w:p>
-        <w:p>
-          <w:pPr>
-            <w:pStyle w:val="Header"/>
-            <w:tabs>
-              <w:tab w:val="clear" w:pos="720"/>
-              <w:tab w:val="center" w:pos="-2520" w:leader="none"/>
-              <w:tab w:val="right" w:pos="9900" w:leader="none"/>
-            </w:tabs>
-            <w:rPr>
-              <w:rFonts w:ascii="Arial" w:hAnsi="Arial" w:cs="Arial"/>
-              <w:sz w:val="18"/>
-              <w:szCs w:val="18"/>
-              <w:lang w:val="en-US" w:eastAsia="en-US"/>
-            </w:rPr>
-          </w:pPr>
-          <w:r>
-            <w:rPr>
-              <w:rFonts w:eastAsia="Arial" w:cs="Arial" w:ascii="Arial" w:hAnsi="Arial"/>
-              <w:sz w:val="18"/>
-              <w:szCs w:val="18"/>
-              <w:lang w:val="en-US" w:eastAsia="en-US"/>
-            </w:rPr>
-            <w:t xml:space="preserve">   </w:t>
-          </w:r>
-          <w:r>
-            <w:rPr>
-              <w:rFonts w:cs="Arial" w:ascii="Arial" w:hAnsi="Arial"/>
-              <w:sz w:val="18"/>
-              <w:szCs w:val="18"/>
-              <w:lang w:val="en-US" w:eastAsia="en-US"/>
-            </w:rPr>
-            <w:t>Bhubaneshwar-751002,Orissa</w:t>
-          </w:r>
-        </w:p>
-        <w:p>
-          <w:pPr>
-            <w:pStyle w:val="Header"/>
-            <w:tabs>
-              <w:tab w:val="clear" w:pos="720"/>
-              <w:tab w:val="center" w:pos="-2520" w:leader="none"/>
-            </w:tabs>
-            <w:rPr>
-              <w:rFonts w:ascii="Arial" w:hAnsi="Arial" w:cs="Arial"/>
-              <w:sz w:val="18"/>
-              <w:szCs w:val="18"/>
-              <w:lang w:val="en-US" w:eastAsia="en-US"/>
-            </w:rPr>
-          </w:pPr>
-          <w:r>
-            <w:rPr>
-              <w:rFonts w:cs="Arial" w:ascii="Arial" w:hAnsi="Arial"/>
-              <w:sz w:val="18"/>
-              <w:szCs w:val="18"/>
-              <w:lang w:val="en-US" w:eastAsia="en-US"/>
-            </w:rPr>
-            <w:t xml:space="preserve">Phone:+91-9437021111                                                                                                                </w:t>
-          </w:r>
-        </w:p>
-        <w:p>
-          <w:pPr>
-            <w:pStyle w:val="Header"/>
-            <w:tabs>
-              <w:tab w:val="clear" w:pos="720"/>
-              <w:tab w:val="center" w:pos="-2520" w:leader="none"/>
-            </w:tabs>
-            <w:rPr>
-              <w:rFonts w:ascii="Arial" w:hAnsi="Arial" w:cs="Arial"/>
-              <w:sz w:val="18"/>
-              <w:szCs w:val="18"/>
-              <w:lang w:val="en-US" w:eastAsia="en-US"/>
-            </w:rPr>
-          </w:pPr>
-          <w:r>
-            <w:rPr>
-              <w:rFonts w:eastAsia="Arial" w:cs="Arial" w:ascii="Arial" w:hAnsi="Arial"/>
-              <w:sz w:val="18"/>
-              <w:szCs w:val="18"/>
-              <w:lang w:val="en-US" w:eastAsia="en-US"/>
-            </w:rPr>
-            <w:t xml:space="preserve">   </w:t>
-          </w:r>
-          <w:r>
-            <w:rPr>
-              <w:rFonts w:cs="Arial" w:ascii="Arial" w:hAnsi="Arial"/>
-              <w:sz w:val="18"/>
-              <w:szCs w:val="18"/>
-              <w:lang w:val="en-US" w:eastAsia="en-US"/>
-            </w:rPr>
-            <w:t>Fax: (0674) 2341435</w:t>
-          </w:r>
-        </w:p>
-        <w:p>
-          <w:pPr>
-            <w:pStyle w:val="Header"/>
-            <w:tabs>
-              <w:tab w:val="clear" w:pos="720"/>
-            </w:tabs>
-            <w:rPr>
-              <w:rFonts w:ascii="Arial" w:hAnsi="Arial" w:cs="Arial"/>
-              <w:sz w:val="18"/>
-              <w:szCs w:val="18"/>
-              <w:u w:val="single"/>
-              <w:lang w:val="en-US" w:eastAsia="en-US"/>
-            </w:rPr>
-          </w:pPr>
-          <w:r>
-            <w:rPr>
-              <w:rFonts w:eastAsia="Arial" w:cs="Arial" w:ascii="Arial" w:hAnsi="Arial"/>
-              <w:sz w:val="18"/>
-              <w:szCs w:val="18"/>
-              <w:lang w:val="en-US" w:eastAsia="en-US"/>
-            </w:rPr>
-            <w:t xml:space="preserve">   </w:t>
-          </w:r>
-          <w:r>
-            <w:rPr>
-              <w:rFonts w:cs="Arial" w:ascii="Arial" w:hAnsi="Arial"/>
-              <w:sz w:val="18"/>
-              <w:szCs w:val="18"/>
-              <w:lang w:val="en-US" w:eastAsia="en-US"/>
-            </w:rPr>
-            <w:t>Email: info@jagannathcrushers.com</w:t>
-          </w:r>
-        </w:p>
-      </w:tc>
-    </w:tr>
-  </w:tbl>
-  <w:p>
-    <w:pPr>
-      <w:pStyle w:val="Header"/>
-      <w:tabs>
-        <w:tab w:val="clear" w:pos="720"/>
-      </w:tabs>
-      <w:ind w:hanging="0" w:end="0"/>
-      <w:jc w:val="both"/>
-      <w:rPr>
-        <w:rFonts w:ascii="Arial" w:hAnsi="Arial" w:cs="Arial"/>
-        <w:sz w:val="18"/>
-        <w:szCs w:val="18"/>
-        <w:u w:val="single"/>
-      </w:rPr>
-    </w:pPr>
-    <w:r>
-      <w:rPr>
-        <w:rFonts w:cs="Arial" w:ascii="Arial" w:hAnsi="Arial"/>
-        <w:sz w:val="18"/>
-        <w:szCs w:val="18"/>
-        <w:u w:val="single"/>
-      </w:rPr>
-    </w:r>
-  </w:p>
-  <w:p>
-    <w:pPr>
-      <w:pStyle w:val="Header"/>
-      <w:tabs>
-        <w:tab w:val="clear" w:pos="720"/>
-      </w:tabs>
-      <w:jc w:val="both"/>
-      <w:rPr>
-        <w:rFonts w:ascii="Arial" w:hAnsi="Arial" w:cs="Arial"/>
-        <w:sz w:val="18"/>
-        <w:szCs w:val="18"/>
-        <w:u w:val="single"/>
-      </w:rPr>
-    </w:pPr>
-    <w:r>
-      <w:rPr>
-        <w:rFonts w:cs="Arial" w:ascii="Arial" w:hAnsi="Arial"/>
-        <w:sz w:val="18"/>
-        <w:szCs w:val="18"/>
-        <w:u w:val="single"/>
+        <w:sz w:val="2"/>
       </w:rPr>
     </w:r>
   </w:p>
@@ -683,21 +261,12 @@
         <w:p>
           <w:pPr>
             <w:pStyle w:val="Normal"/>
-            <w:ind w:hanging="0" w:end="0"/>
-            <w:rPr>
-              <w:rFonts w:ascii="Cambria" w:hAnsi="Cambria" w:cs="Calibri"/>
-              <w:b/>
-              <w:bCs/>
-              <w:color w:val="00B050"/>
-              <w:sz w:val="40"/>
-              <w:szCs w:val="40"/>
-              <w:u w:val="single"/>
-              <w:lang w:bidi="ar-SA"/>
-            </w:rPr>
+            <w:ind w:start="1584" w:end="0" w:firstLine="0"/>
+            <w:jc w:val="center"/>
           </w:pPr>
           <w:r>
             <w:rPr>
-              <w:rFonts w:cs="Calibri" w:ascii="Garamond Premr Pro;Times New Roman" w:hAnsi="Garamond Premr Pro;Times New Roman"/>
+              <w:rFonts w:ascii="Garamond Premr Pro" w:hAnsi="Garamond Premr Pro" w:cs="Calibri"/>
               <w:b/>
               <w:bCs/>
               <w:color w:val="00B050"/>
@@ -707,31 +276,70 @@
               <w:lang w:bidi="ar-SA"/>
             </w:rPr>
             <w:t>Jagannath Corporation Projects Pvt. Ltd.</w:t>
-            <w:br/>
           </w:r>
+        </w:p>
+        <w:p>
+          <w:pPr>
+            <w:pStyle w:val="Normal"/>
+            <w:ind w:start="1584" w:end="0" w:firstLine="0"/>
+            <w:jc w:val="center"/>
+          </w:pPr>
           <w:r>
             <w:rPr>
-              <w:rFonts w:cs="Calibri" w:ascii="Cambria" w:hAnsi="Cambria"/>
-              <w:b/>
-              <w:bCs/>
-              <w:color w:val="00B050"/>
+              <w:rFonts w:ascii="Cambria" w:hAnsi="Cambria" w:cs="Calibri"/>
+              <w:sz w:val="22"/>
+              <w:szCs w:val="22"/>
               <w:lang w:bidi="ar-SA"/>
             </w:rPr>
-            <w:t xml:space="preserve">                                         </w:t>
+            <w:t>Plot 397, Lewis Road, Sarangi Bhawan (Ground Floor),</w:t>
           </w:r>
+        </w:p>
+        <w:p>
+          <w:pPr>
+            <w:pStyle w:val="Normal"/>
+            <w:ind w:start="1584" w:end="0" w:firstLine="0"/>
+            <w:jc w:val="center"/>
+          </w:pPr>
           <w:r>
             <w:rPr>
-              <w:rFonts w:cs="Calibri" w:ascii="Cambria" w:hAnsi="Cambria"/>
-              <w:bCs/>
+              <w:rFonts w:ascii="Cambria" w:hAnsi="Cambria" w:cs="Calibri"/>
+              <w:sz w:val="22"/>
+              <w:szCs w:val="22"/>
               <w:lang w:bidi="ar-SA"/>
             </w:rPr>
-            <w:t>Plot 397,Lewis Road, Sarangi  Bhawan(Ground Floor),</w:t>
-            <w:br/>
-            <w:t xml:space="preserve">                                         Old Town, Bhubaneswar-751002,Odisha.</w:t>
-            <w:br/>
-            <w:t xml:space="preserve">                                         Phone:+91-7894444400   </w:t>
-            <w:br/>
-            <w:t xml:space="preserve">                                        Email: info@jcltd.in,CIN-U27100OR2010PTC011664</w:t>
+            <w:t>Old Town, Bhubaneswar-751002, Odisha.</w:t>
+          </w:r>
+        </w:p>
+        <w:p>
+          <w:pPr>
+            <w:pStyle w:val="Normal"/>
+            <w:ind w:start="1584" w:end="0" w:firstLine="0"/>
+            <w:jc w:val="center"/>
+          </w:pPr>
+          <w:r>
+            <w:rPr>
+              <w:rFonts w:ascii="Cambria" w:hAnsi="Cambria" w:cs="Calibri"/>
+              <w:sz w:val="22"/>
+              <w:szCs w:val="22"/>
+              <w:lang w:bidi="ar-SA"/>
+            </w:rPr>
+            <w:t>Phone: +91-7894444400</w:t>
+          </w:r>
+        </w:p>
+        <w:p>
+          <w:pPr>
+            <w:pStyle w:val="Normal"/>
+            <w:ind w:start="1584" w:end="0" w:firstLine="0"/>
+            <w:jc w:val="center"/>
+          </w:pPr>
+          <w:r>
+            <w:rPr>
+              <w:rFonts w:ascii="Cambria" w:hAnsi="Cambria" w:cs="Calibri"/>
+              <w:sz w:val="22"/>
+              <w:szCs w:val="22"/>
+              <w:lang w:bidi="ar-SA"/>
+            </w:rPr>
+            <w:t>Email: info@jcltd.in, CIN: U27100OR2010PTC011664</w:t>
           </w:r>
         </w:p>
       </w:tc>

</xml_diff>

<commit_message>
Match letterhead .docx exactly to the company's reference PDF
The company's PDF export shows the title on one line in Times New Roman
Bold (the font Word actually substitutes for the never-installed 'Garamond
Premr Pro') with the address block left-aligned beneath it. Rebuild the
text inside the header's existing layout table with fixed indents so the
rendered positions match the reference within 1-2pt, keep all text
verbatim, and refresh the preview PDF.

Co-Authored-By: Claude Fable 5 <noreply@anthropic.com>
Claude-Session: https://claude.ai/code/session_01TSaFJjMEcFc18hcGmusxrV
</commit_message>
<xml_diff>
--- a/templates/letterhead/JCPPL_letterhead.docx
+++ b/templates/letterhead/JCPPL_letterhead.docx
@@ -261,17 +261,17 @@
         <w:p>
           <w:pPr>
             <w:pStyle w:val="Normal"/>
-            <w:ind w:start="1584" w:end="0" w:firstLine="0"/>
-            <w:jc w:val="center"/>
+            <w:spacing w:before="0" w:after="0" w:line="240" w:lineRule="auto"/>
+            <w:ind w:left="0" w:right="0" w:firstLine="0"/>
           </w:pPr>
           <w:r>
             <w:rPr>
-              <w:rFonts w:ascii="Garamond Premr Pro" w:hAnsi="Garamond Premr Pro" w:cs="Calibri"/>
+              <w:rFonts w:ascii="Times New Roman" w:hAnsi="Times New Roman" w:cs="Times New Roman"/>
               <w:b/>
               <w:bCs/>
               <w:color w:val="00B050"/>
               <w:sz w:val="40"/>
-              <w:szCs w:val="44"/>
+              <w:szCs w:val="40"/>
               <w:u w:val="single"/>
               <w:lang w:bidi="ar-SA"/>
             </w:rPr>
@@ -281,8 +281,8 @@
         <w:p>
           <w:pPr>
             <w:pStyle w:val="Normal"/>
-            <w:ind w:start="1584" w:end="0" w:firstLine="0"/>
-            <w:jc w:val="center"/>
+            <w:spacing w:before="0" w:after="0" w:line="240" w:lineRule="auto"/>
+            <w:ind w:left="1985" w:right="0" w:firstLine="0"/>
           </w:pPr>
           <w:r>
             <w:rPr>
@@ -291,14 +291,14 @@
               <w:szCs w:val="22"/>
               <w:lang w:bidi="ar-SA"/>
             </w:rPr>
-            <w:t>Plot 397, Lewis Road, Sarangi Bhawan (Ground Floor),</w:t>
+            <w:t xml:space="preserve">Plot 397,Lewis Road, Sarangi  Bhawan(Ground Floor),</w:t>
           </w:r>
         </w:p>
         <w:p>
           <w:pPr>
             <w:pStyle w:val="Normal"/>
-            <w:ind w:start="1584" w:end="0" w:firstLine="0"/>
-            <w:jc w:val="center"/>
+            <w:spacing w:before="0" w:after="0" w:line="240" w:lineRule="auto"/>
+            <w:ind w:left="1985" w:right="0" w:firstLine="0"/>
           </w:pPr>
           <w:r>
             <w:rPr>
@@ -307,14 +307,14 @@
               <w:szCs w:val="22"/>
               <w:lang w:bidi="ar-SA"/>
             </w:rPr>
-            <w:t>Old Town, Bhubaneswar-751002, Odisha.</w:t>
+            <w:t xml:space="preserve">Old Town, Bhubaneswar-751002,Odisha.</w:t>
           </w:r>
         </w:p>
         <w:p>
           <w:pPr>
             <w:pStyle w:val="Normal"/>
-            <w:ind w:start="1584" w:end="0" w:firstLine="0"/>
-            <w:jc w:val="center"/>
+            <w:spacing w:before="0" w:after="0" w:line="240" w:lineRule="auto"/>
+            <w:ind w:left="1985" w:right="0" w:firstLine="0"/>
           </w:pPr>
           <w:r>
             <w:rPr>
@@ -323,14 +323,14 @@
               <w:szCs w:val="22"/>
               <w:lang w:bidi="ar-SA"/>
             </w:rPr>
-            <w:t>Phone: +91-7894444400</w:t>
+            <w:t xml:space="preserve">Phone:+91-7894444400</w:t>
           </w:r>
         </w:p>
         <w:p>
           <w:pPr>
             <w:pStyle w:val="Normal"/>
-            <w:ind w:start="1584" w:end="0" w:firstLine="0"/>
-            <w:jc w:val="center"/>
+            <w:spacing w:before="0" w:after="0" w:line="240" w:lineRule="auto"/>
+            <w:ind w:left="1985" w:right="0" w:firstLine="0"/>
           </w:pPr>
           <w:r>
             <w:rPr>
@@ -339,7 +339,7 @@
               <w:szCs w:val="22"/>
               <w:lang w:bidi="ar-SA"/>
             </w:rPr>
-            <w:t>Email: info@jcltd.in, CIN: U27100OR2010PTC011664</w:t>
+            <w:t xml:space="preserve">Email: info@jcltd.in,CIN-U27100OR2010PTC011664</w:t>
           </w:r>
         </w:p>
       </w:tc>

</xml_diff>

<commit_message>
Fix letterhead logo geometry to match the reference exactly
The converted logo anchor carried a negative page offset and a distorting
crop rectangle that renderers compensated for differently (Word drew the
logo hanging off the page edge). Replace it with a clean anchor holding
the literal geometry measured from the company's reference PDF, with the
blip's transparent padding compensated, so the logo lands at the same
position and size (within 1px) in every renderer. Refresh the preview.

Co-Authored-By: Claude Fable 5 <noreply@anthropic.com>
Claude-Session: https://claude.ai/code/session_01TSaFJjMEcFc18hcGmusxrV
</commit_message>
<xml_diff>
--- a/templates/letterhead/JCPPL_letterhead.docx
+++ b/templates/letterhead/JCPPL_letterhead.docx
@@ -138,33 +138,32 @@
               <w:lang w:bidi="ar-SA"/>
             </w:rPr>
             <w:drawing>
-              <wp:anchor behindDoc="1" distT="0" distB="0" distL="114935" distR="114935" simplePos="0" locked="0" layoutInCell="1" allowOverlap="1" relativeHeight="3">
+              <wp:anchor behindDoc="0" distT="0" distB="0" distL="0" distR="0" simplePos="0" locked="0" layoutInCell="0" allowOverlap="1" relativeHeight="10">
                 <wp:simplePos x="0" y="0"/>
                 <wp:positionH relativeFrom="page">
-                  <wp:posOffset>-125730</wp:posOffset>
+                  <wp:posOffset>520724</wp:posOffset>
                 </wp:positionH>
                 <wp:positionV relativeFrom="page">
-                  <wp:posOffset>66040</wp:posOffset>
+                  <wp:posOffset>361023</wp:posOffset>
                 </wp:positionV>
-                <wp:extent cx="1638300" cy="1373505"/>
+                <wp:extent cx="1637744" cy="1383278"/>
                 <wp:effectExtent l="0" t="0" r="0" b="0"/>
                 <wp:wrapNone/>
-                <wp:docPr id="2" name="Picture 1" descr="" title=""/>
+                <wp:docPr id="10" name="JCPPL Logo" descr="" title=""/>
                 <wp:cNvGraphicFramePr>
-                  <a:graphicFrameLocks xmlns:a="http://schemas.openxmlformats.org/drawingml/2006/main" noChangeAspect="1"/>
+                  <a:graphicFrameLocks xmlns:a="http://schemas.openxmlformats.org/drawingml/2006/main"/>
                 </wp:cNvGraphicFramePr>
                 <a:graphic xmlns:a="http://schemas.openxmlformats.org/drawingml/2006/main">
                   <a:graphicData uri="http://schemas.openxmlformats.org/drawingml/2006/picture">
                     <pic:pic xmlns:pic="http://schemas.openxmlformats.org/drawingml/2006/picture">
                       <pic:nvPicPr>
-                        <pic:cNvPr id="2" name="Picture 1" descr="" title=""/>
+                        <pic:cNvPr id="10" name="JCPPL Logo" descr="" title=""/>
                         <pic:cNvPicPr>
-                          <a:picLocks noChangeAspect="1" noChangeArrowheads="1"/>
+                          <a:picLocks noChangeArrowheads="1"/>
                         </pic:cNvPicPr>
                       </pic:nvPicPr>
                       <pic:blipFill>
                         <a:blip r:embed="rId1"/>
-                        <a:srcRect l="-11" t="-69" r="-11" b="-69"/>
                         <a:stretch>
                           <a:fillRect/>
                         </a:stretch>
@@ -172,7 +171,7 @@
                       <pic:spPr bwMode="auto">
                         <a:xfrm>
                           <a:off x="0" y="0"/>
-                          <a:ext cx="1638300" cy="1373505"/>
+                          <a:ext cx="1637744" cy="1383278"/>
                         </a:xfrm>
                         <a:prstGeom prst="rect">
                           <a:avLst/>

</xml_diff>

<commit_message>
Revise letterhead design: no rule, details on two lines
Per feedback: remove the green rule and condense the details to exactly
two right-aligned lines under the header row (full address on one line;
phone, email and CIN on the other), with the company name beside the logo.

Co-Authored-By: Claude Fable 5 <noreply@anthropic.com>
Claude-Session: https://claude.ai/code/session_01TSaFJjMEcFc18hcGmusxrV
</commit_message>
<xml_diff>
--- a/templates/letterhead/JCPPL_letterhead.docx
+++ b/templates/letterhead/JCPPL_letterhead.docx
@@ -193,7 +193,7 @@
         </w:tcPr>
         <w:p>
           <w:pPr>
-            <w:spacing w:after="100" w:before="0"/>
+            <w:spacing w:after="0" w:before="0"/>
             <w:jc w:val="right"/>
           </w:pPr>
           <w:r>
@@ -208,9 +208,23 @@
             <w:t xml:space="preserve">Jagannath Corporation Projects Pvt. Ltd.</w:t>
           </w:r>
         </w:p>
+      </w:tc>
+    </w:tr>
+    <w:tr>
+      <w:tc>
+        <w:tcPr>
+          <w:tcW w:type="dxa" w:w="9026"/>
+          <w:gridSpan w:val="2"/>
+          <w:tcBorders>
+            <w:top w:val="none" w:color="FFFFFF" w:sz="0"/>
+            <w:left w:val="none" w:color="FFFFFF" w:sz="0"/>
+            <w:bottom w:val="none" w:color="FFFFFF" w:sz="0"/>
+            <w:right w:val="none" w:color="FFFFFF" w:sz="0"/>
+          </w:tcBorders>
+        </w:tcPr>
         <w:p>
           <w:pPr>
-            <w:spacing w:after="20" w:before="0"/>
+            <w:spacing w:after="20" w:before="120"/>
             <w:jc w:val="right"/>
           </w:pPr>
           <w:r>
@@ -220,55 +234,7 @@
               <w:sz w:val="19"/>
               <w:szCs w:val="19"/>
             </w:rPr>
-            <w:t xml:space="preserve">Plot 397, Lewis Road, Sarangi Bhawan (Ground Floor),</w:t>
-          </w:r>
-        </w:p>
-        <w:p>
-          <w:pPr>
-            <w:spacing w:after="60" w:before="0"/>
-            <w:jc w:val="right"/>
-          </w:pPr>
-          <w:r>
-            <w:rPr>
-              <w:rFonts w:ascii="Cambria" w:cs="Cambria" w:eastAsia="Cambria" w:hAnsi="Cambria"/>
-              <w:color w:val="333333"/>
-              <w:sz w:val="19"/>
-              <w:szCs w:val="19"/>
-            </w:rPr>
-            <w:t xml:space="preserve">Old Town, Bhubaneswar – 751002, Odisha</w:t>
-          </w:r>
-        </w:p>
-        <w:p>
-          <w:pPr>
-            <w:spacing w:after="20" w:before="0"/>
-            <w:jc w:val="right"/>
-          </w:pPr>
-          <w:r>
-            <w:rPr>
-              <w:rFonts w:ascii="Cambria" w:cs="Cambria" w:eastAsia="Cambria" w:hAnsi="Cambria"/>
-              <w:color w:val="333333"/>
-              <w:sz w:val="19"/>
-              <w:szCs w:val="19"/>
-            </w:rPr>
-            <w:t xml:space="preserve">Phone: +91 78944 44400</w:t>
-          </w:r>
-          <w:r>
-            <w:rPr>
-              <w:rFonts w:ascii="Cambria" w:cs="Cambria" w:eastAsia="Cambria" w:hAnsi="Cambria"/>
-              <w:color w:val="333333"/>
-              <w:sz w:val="19"/>
-              <w:szCs w:val="19"/>
-            </w:rPr>
-            <w:t xml:space="preserve">   ·   </w:t>
-          </w:r>
-          <w:r>
-            <w:rPr>
-              <w:rFonts w:ascii="Cambria" w:cs="Cambria" w:eastAsia="Cambria" w:hAnsi="Cambria"/>
-              <w:color w:val="333333"/>
-              <w:sz w:val="19"/>
-              <w:szCs w:val="19"/>
-            </w:rPr>
-            <w:t xml:space="preserve">Email: info@jcltd.in</w:t>
+            <w:t xml:space="preserve">Plot 397, Lewis Road, Sarangi Bhawan (Ground Floor), Old Town, Bhubaneswar – 751002, Odisha</w:t>
           </w:r>
         </w:p>
         <w:p>
@@ -279,9 +245,18 @@
           <w:r>
             <w:rPr>
               <w:rFonts w:ascii="Cambria" w:cs="Cambria" w:eastAsia="Cambria" w:hAnsi="Cambria"/>
+              <w:color w:val="333333"/>
+              <w:sz w:val="19"/>
+              <w:szCs w:val="19"/>
+            </w:rPr>
+            <w:t xml:space="preserve">Phone: +91 78944 44400   ·   Email: info@jcltd.in   ·   </w:t>
+          </w:r>
+          <w:r>
+            <w:rPr>
+              <w:rFonts w:ascii="Cambria" w:cs="Cambria" w:eastAsia="Cambria" w:hAnsi="Cambria"/>
               <w:color w:val="595959"/>
-              <w:sz w:val="17"/>
-              <w:szCs w:val="17"/>
+              <w:sz w:val="19"/>
+              <w:szCs w:val="19"/>
             </w:rPr>
             <w:t xml:space="preserve">CIN: U27100OR2010PTC011664</w:t>
           </w:r>
@@ -289,14 +264,6 @@
       </w:tc>
     </w:tr>
   </w:tbl>
-  <w:p>
-    <w:pPr>
-      <w:pBdr>
-        <w:bottom w:val="single" w:color="00B050" w:sz="14" w:space="0"/>
-      </w:pBdr>
-      <w:spacing w:after="0" w:before="140"/>
-    </w:pPr>
-  </w:p>
 </w:hdr>
 </file>
 

</xml_diff>

<commit_message>
Revise letterhead: logo further left, larger name, details under it
Move the logo 0.6in from the page edge (header block extends past the
body margins like the original), left-align the text block so it starts
beside the logo, raise the company name to 20pt, and set the two detail
lines smaller (8.5pt) directly under the name.

Co-Authored-By: Claude Fable 5 <noreply@anthropic.com>
Claude-Session: https://claude.ai/code/session_01TSaFJjMEcFc18hcGmusxrV
</commit_message>
<xml_diff>
--- a/templates/letterhead/JCPPL_letterhead.docx
+++ b/templates/letterhead/JCPPL_letterhead.docx
@@ -108,7 +108,8 @@
 <w:hdr xmlns:wpc="http://schemas.microsoft.com/office/word/2010/wordprocessingCanvas" xmlns:mc="http://schemas.openxmlformats.org/markup-compatibility/2006" xmlns:o="urn:schemas-microsoft-com:office:office" xmlns:r="http://schemas.openxmlformats.org/officeDocument/2006/relationships" xmlns:m="http://schemas.openxmlformats.org/officeDocument/2006/math" xmlns:v="urn:schemas-microsoft-com:vml" xmlns:wp14="http://schemas.microsoft.com/office/word/2010/wordprocessingDrawing" xmlns:wp="http://schemas.openxmlformats.org/drawingml/2006/wordprocessingDrawing" xmlns:w10="urn:schemas-microsoft-com:office:word" xmlns:w="http://schemas.openxmlformats.org/wordprocessingml/2006/main" xmlns:w14="http://schemas.microsoft.com/office/word/2010/wordml" xmlns:w15="http://schemas.microsoft.com/office/word/2012/wordml" xmlns:wpg="http://schemas.microsoft.com/office/word/2010/wordprocessingGroup" xmlns:wpi="http://schemas.microsoft.com/office/word/2010/wordprocessingInk" xmlns:wne="http://schemas.microsoft.com/office/word/2006/wordml" xmlns:wps="http://schemas.microsoft.com/office/word/2010/wordprocessingShape" xmlns:cx="http://schemas.microsoft.com/office/drawing/2014/chartex" xmlns:cx1="http://schemas.microsoft.com/office/drawing/2015/9/8/chartex" xmlns:cx2="http://schemas.microsoft.com/office/drawing/2015/10/21/chartex" xmlns:cx3="http://schemas.microsoft.com/office/drawing/2016/5/9/chartex" xmlns:cx4="http://schemas.microsoft.com/office/drawing/2016/5/10/chartex" xmlns:cx5="http://schemas.microsoft.com/office/drawing/2016/5/11/chartex" xmlns:cx6="http://schemas.microsoft.com/office/drawing/2016/5/12/chartex" xmlns:cx7="http://schemas.microsoft.com/office/drawing/2016/5/13/chartex" xmlns:cx8="http://schemas.microsoft.com/office/drawing/2016/5/14/chartex" xmlns:w16cid="http://schemas.microsoft.com/office/word/2016/wordml/cid" xmlns:w16se="http://schemas.microsoft.com/office/word/2015/wordml/symex">
   <w:tbl>
     <w:tblPr>
-      <w:tblW w:type="dxa" w:w="9026"/>
+      <w:tblW w:type="dxa" w:w="10178"/>
+      <w:tblInd w:type="dxa" w:w="-576"/>
       <w:tblBorders>
         <w:top w:val="none" w:color="FFFFFF" w:sz="0"/>
         <w:left w:val="none" w:color="FFFFFF" w:sz="0"/>
@@ -119,13 +120,13 @@
       </w:tblBorders>
     </w:tblPr>
     <w:tblGrid>
-      <w:gridCol w:w="2200"/>
-      <w:gridCol w:w="6826"/>
+      <w:gridCol w:w="2304"/>
+      <w:gridCol w:w="7874"/>
     </w:tblGrid>
     <w:tr>
       <w:tc>
         <w:tcPr>
-          <w:tcW w:type="dxa" w:w="2200"/>
+          <w:tcW w:type="dxa" w:w="2304"/>
           <w:tcBorders>
             <w:top w:val="none" w:color="FFFFFF" w:sz="0"/>
             <w:left w:val="none" w:color="FFFFFF" w:sz="0"/>
@@ -182,7 +183,7 @@
       </w:tc>
       <w:tc>
         <w:tcPr>
-          <w:tcW w:type="dxa" w:w="6826"/>
+          <w:tcW w:type="dxa" w:w="7874"/>
           <w:tcBorders>
             <w:top w:val="none" w:color="FFFFFF" w:sz="0"/>
             <w:left w:val="none" w:color="FFFFFF" w:sz="0"/>
@@ -193,8 +194,8 @@
         </w:tcPr>
         <w:p>
           <w:pPr>
-            <w:spacing w:after="0" w:before="0"/>
-            <w:jc w:val="right"/>
+            <w:spacing w:after="80" w:before="0"/>
+            <w:jc w:val="left"/>
           </w:pPr>
           <w:r>
             <w:rPr>
@@ -202,37 +203,23 @@
               <w:b/>
               <w:bCs/>
               <w:color w:val="00B050"/>
-              <w:sz w:val="34"/>
-              <w:szCs w:val="34"/>
+              <w:sz w:val="40"/>
+              <w:szCs w:val="40"/>
             </w:rPr>
             <w:t xml:space="preserve">Jagannath Corporation Projects Pvt. Ltd.</w:t>
           </w:r>
         </w:p>
-      </w:tc>
-    </w:tr>
-    <w:tr>
-      <w:tc>
-        <w:tcPr>
-          <w:tcW w:type="dxa" w:w="9026"/>
-          <w:gridSpan w:val="2"/>
-          <w:tcBorders>
-            <w:top w:val="none" w:color="FFFFFF" w:sz="0"/>
-            <w:left w:val="none" w:color="FFFFFF" w:sz="0"/>
-            <w:bottom w:val="none" w:color="FFFFFF" w:sz="0"/>
-            <w:right w:val="none" w:color="FFFFFF" w:sz="0"/>
-          </w:tcBorders>
-        </w:tcPr>
         <w:p>
           <w:pPr>
-            <w:spacing w:after="20" w:before="120"/>
-            <w:jc w:val="right"/>
+            <w:spacing w:after="20" w:before="0"/>
+            <w:jc w:val="left"/>
           </w:pPr>
           <w:r>
             <w:rPr>
               <w:rFonts w:ascii="Cambria" w:cs="Cambria" w:eastAsia="Cambria" w:hAnsi="Cambria"/>
               <w:color w:val="333333"/>
-              <w:sz w:val="19"/>
-              <w:szCs w:val="19"/>
+              <w:sz w:val="17"/>
+              <w:szCs w:val="17"/>
             </w:rPr>
             <w:t xml:space="preserve">Plot 397, Lewis Road, Sarangi Bhawan (Ground Floor), Old Town, Bhubaneswar – 751002, Odisha</w:t>
           </w:r>
@@ -240,14 +227,14 @@
         <w:p>
           <w:pPr>
             <w:spacing w:after="0" w:before="0"/>
-            <w:jc w:val="right"/>
+            <w:jc w:val="left"/>
           </w:pPr>
           <w:r>
             <w:rPr>
               <w:rFonts w:ascii="Cambria" w:cs="Cambria" w:eastAsia="Cambria" w:hAnsi="Cambria"/>
               <w:color w:val="333333"/>
-              <w:sz w:val="19"/>
-              <w:szCs w:val="19"/>
+              <w:sz w:val="17"/>
+              <w:szCs w:val="17"/>
             </w:rPr>
             <w:t xml:space="preserve">Phone: +91 78944 44400   ·   Email: info@jcltd.in   ·   </w:t>
           </w:r>
@@ -255,8 +242,8 @@
             <w:rPr>
               <w:rFonts w:ascii="Cambria" w:cs="Cambria" w:eastAsia="Cambria" w:hAnsi="Cambria"/>
               <w:color w:val="595959"/>
-              <w:sz w:val="19"/>
-              <w:szCs w:val="19"/>
+              <w:sz w:val="17"/>
+              <w:szCs w:val="17"/>
             </w:rPr>
             <w:t xml:space="preserve">CIN: U27100OR2010PTC011664</w:t>
           </w:r>

</xml_diff>